<commit_message>
docs: atualiza nome para Lucas Tetsuya Hiratuca e incorpora prints de resultado no relatorio
</commit_message>
<xml_diff>
--- a/P1_Relatorio_LucasHiratuca.docx
+++ b/P1_Relatorio_LucasHiratuca.docx
@@ -81,7 +81,7 @@
           <w:b/>
           <w:sz w:val="28"/>
         </w:rPr>
-        <w:t>Lucas Hiratuca</w:t>
+        <w:t>Lucas Tetsuya Hiratuca</w:t>
       </w:r>
     </w:p>
     <w:p>
@@ -3452,55 +3452,46 @@
         <w:t>Figura 7: Atividade 4 – evidência da entrega (link, data e hora visíveis)</w:t>
       </w:r>
     </w:p>
-    <w:tbl>
-      <w:tblPr>
-        <w:tblW w:type="auto" w:w="0"/>
+    <w:p>
+      <w:pPr>
+        <w:spacing w:before="160" w:after="80"/>
         <w:jc w:val="center"/>
-        <w:tblLook w:firstColumn="1" w:firstRow="1" w:lastColumn="0" w:lastRow="0" w:noHBand="0" w:noVBand="1" w:val="04A0"/>
-      </w:tblPr>
-      <w:tblGrid>
-        <w:gridCol w:w="9418"/>
-      </w:tblGrid>
-      <w:tr>
-        <w:tc>
-          <w:tcPr>
-            <w:tcW w:type="dxa" w:w="9360"/>
-            <w:shd w:fill="F1F5F9"/>
-            <w:tcMar>
-              <w:top w:w="350" w:type="dxa"/>
-              <w:bottom w:w="350" w:type="dxa"/>
-              <w:left w:w="200" w:type="dxa"/>
-              <w:right w:w="200" w:type="dxa"/>
-            </w:tcMar>
-          </w:tcPr>
-          <w:p>
-            <w:pPr>
-              <w:spacing w:after="80"/>
-              <w:jc w:val="center"/>
-            </w:pPr>
-            <w:r>
-              <w:rPr>
-                <w:rFonts w:ascii="Arial" w:hAnsi="Arial"/>
-                <w:b/>
-                <w:color w:val="64748B"/>
-                <w:sz w:val="22"/>
-              </w:rPr>
-              <w:t>[ COLE O PRINT AQUI ]</w:t>
-              <w:br/>
-            </w:r>
-            <w:r>
-              <w:rPr>
-                <w:rFonts w:ascii="Arial" w:hAnsi="Arial"/>
-                <w:i/>
-                <w:color w:val="94A3B8"/>
-                <w:sz w:val="18"/>
-              </w:rPr>
-              <w:t>Clique nesta caixa e cole a imagem (Ctrl + V)</w:t>
-            </w:r>
-          </w:p>
-        </w:tc>
-      </w:tr>
-    </w:tbl>
+      </w:pPr>
+      <w:r>
+        <w:drawing>
+          <wp:inline xmlns:a="http://schemas.openxmlformats.org/drawingml/2006/main" xmlns:pic="http://schemas.openxmlformats.org/drawingml/2006/picture">
+            <wp:extent cx="5486400" cy="2053406"/>
+            <wp:docPr id="1" name="Picture 1"/>
+            <wp:cNvGraphicFramePr>
+              <a:graphicFrameLocks noChangeAspect="1"/>
+            </wp:cNvGraphicFramePr>
+            <a:graphic>
+              <a:graphicData uri="http://schemas.openxmlformats.org/drawingml/2006/picture">
+                <pic:pic>
+                  <pic:nvPicPr>
+                    <pic:cNvPr id="0" name="admin_output.png"/>
+                    <pic:cNvPicPr/>
+                  </pic:nvPicPr>
+                  <pic:blipFill>
+                    <a:blip r:embed="rId9"/>
+                    <a:stretch>
+                      <a:fillRect/>
+                    </a:stretch>
+                  </pic:blipFill>
+                  <pic:spPr>
+                    <a:xfrm>
+                      <a:off x="0" y="0"/>
+                      <a:ext cx="5486400" cy="2053406"/>
+                    </a:xfrm>
+                    <a:prstGeom prst="rect"/>
+                  </pic:spPr>
+                </pic:pic>
+              </a:graphicData>
+            </a:graphic>
+          </wp:inline>
+        </w:drawing>
+      </w:r>
+    </w:p>
     <w:p>
       <w:pPr>
         <w:spacing w:before="80" w:after="280"/>
@@ -3512,7 +3503,7 @@
           <w:i/>
           <w:sz w:val="19"/>
         </w:rPr>
-        <w:t>Figura 8: Atividade 4 – resultado (o sistema/mapa/artigo funcionando)</w:t>
+        <w:t>Figura 8: Atividade 4 – resultado (painel de administração de usuários e RBAC em funcionamento)</w:t>
       </w:r>
     </w:p>
     <w:p>
@@ -3963,55 +3954,46 @@
         <w:t>Figura 9: Atividade 5 – evidência da entrega (link, data e hora visíveis)</w:t>
       </w:r>
     </w:p>
-    <w:tbl>
-      <w:tblPr>
-        <w:tblW w:type="auto" w:w="0"/>
+    <w:p>
+      <w:pPr>
+        <w:spacing w:before="160" w:after="80"/>
         <w:jc w:val="center"/>
-        <w:tblLook w:firstColumn="1" w:firstRow="1" w:lastColumn="0" w:lastRow="0" w:noHBand="0" w:noVBand="1" w:val="04A0"/>
-      </w:tblPr>
-      <w:tblGrid>
-        <w:gridCol w:w="9418"/>
-      </w:tblGrid>
-      <w:tr>
-        <w:tc>
-          <w:tcPr>
-            <w:tcW w:type="dxa" w:w="9360"/>
-            <w:shd w:fill="F1F5F9"/>
-            <w:tcMar>
-              <w:top w:w="350" w:type="dxa"/>
-              <w:bottom w:w="350" w:type="dxa"/>
-              <w:left w:w="200" w:type="dxa"/>
-              <w:right w:w="200" w:type="dxa"/>
-            </w:tcMar>
-          </w:tcPr>
-          <w:p>
-            <w:pPr>
-              <w:spacing w:after="80"/>
-              <w:jc w:val="center"/>
-            </w:pPr>
-            <w:r>
-              <w:rPr>
-                <w:rFonts w:ascii="Arial" w:hAnsi="Arial"/>
-                <w:b/>
-                <w:color w:val="64748B"/>
-                <w:sz w:val="22"/>
-              </w:rPr>
-              <w:t>[ COLE O PRINT AQUI ]</w:t>
-              <w:br/>
-            </w:r>
-            <w:r>
-              <w:rPr>
-                <w:rFonts w:ascii="Arial" w:hAnsi="Arial"/>
-                <w:i/>
-                <w:color w:val="94A3B8"/>
-                <w:sz w:val="18"/>
-              </w:rPr>
-              <w:t>Clique nesta caixa e cole a imagem (Ctrl + V)</w:t>
-            </w:r>
-          </w:p>
-        </w:tc>
-      </w:tr>
-    </w:tbl>
+      </w:pPr>
+      <w:r>
+        <w:drawing>
+          <wp:inline xmlns:a="http://schemas.openxmlformats.org/drawingml/2006/main" xmlns:pic="http://schemas.openxmlformats.org/drawingml/2006/picture">
+            <wp:extent cx="5486400" cy="2257533"/>
+            <wp:docPr id="2" name="Picture 2"/>
+            <wp:cNvGraphicFramePr>
+              <a:graphicFrameLocks noChangeAspect="1"/>
+            </wp:cNvGraphicFramePr>
+            <a:graphic>
+              <a:graphicData uri="http://schemas.openxmlformats.org/drawingml/2006/picture">
+                <pic:pic>
+                  <pic:nvPicPr>
+                    <pic:cNvPr id="0" name="logs_output.png"/>
+                    <pic:cNvPicPr/>
+                  </pic:nvPicPr>
+                  <pic:blipFill>
+                    <a:blip r:embed="rId10"/>
+                    <a:stretch>
+                      <a:fillRect/>
+                    </a:stretch>
+                  </pic:blipFill>
+                  <pic:spPr>
+                    <a:xfrm>
+                      <a:off x="0" y="0"/>
+                      <a:ext cx="5486400" cy="2257533"/>
+                    </a:xfrm>
+                    <a:prstGeom prst="rect"/>
+                  </pic:spPr>
+                </pic:pic>
+              </a:graphicData>
+            </a:graphic>
+          </wp:inline>
+        </w:drawing>
+      </w:r>
+    </w:p>
     <w:p>
       <w:pPr>
         <w:spacing w:before="80" w:after="280"/>
@@ -4023,7 +4005,7 @@
           <w:i/>
           <w:sz w:val="19"/>
         </w:rPr>
-        <w:t>Figura 10: Atividade 5 – resultado (o sistema/mapa/artigo funcionando)</w:t>
+        <w:t>Figura 10: Atividade 5 – resultado (tela de consulta de logs de auditoria via Redis Streams)</w:t>
       </w:r>
     </w:p>
     <w:p>
@@ -4474,55 +4456,46 @@
         <w:t>Figura 11: Atividade 6 – evidência da entrega (link, data e hora visíveis)</w:t>
       </w:r>
     </w:p>
-    <w:tbl>
-      <w:tblPr>
-        <w:tblW w:type="auto" w:w="0"/>
+    <w:p>
+      <w:pPr>
+        <w:spacing w:before="160" w:after="80"/>
         <w:jc w:val="center"/>
-        <w:tblLook w:firstColumn="1" w:firstRow="1" w:lastColumn="0" w:lastRow="0" w:noHBand="0" w:noVBand="1" w:val="04A0"/>
-      </w:tblPr>
-      <w:tblGrid>
-        <w:gridCol w:w="9418"/>
-      </w:tblGrid>
-      <w:tr>
-        <w:tc>
-          <w:tcPr>
-            <w:tcW w:type="dxa" w:w="9360"/>
-            <w:shd w:fill="F1F5F9"/>
-            <w:tcMar>
-              <w:top w:w="350" w:type="dxa"/>
-              <w:bottom w:w="350" w:type="dxa"/>
-              <w:left w:w="200" w:type="dxa"/>
-              <w:right w:w="200" w:type="dxa"/>
-            </w:tcMar>
-          </w:tcPr>
-          <w:p>
-            <w:pPr>
-              <w:spacing w:after="80"/>
-              <w:jc w:val="center"/>
-            </w:pPr>
-            <w:r>
-              <w:rPr>
-                <w:rFonts w:ascii="Arial" w:hAnsi="Arial"/>
-                <w:b/>
-                <w:color w:val="64748B"/>
-                <w:sz w:val="22"/>
-              </w:rPr>
-              <w:t>[ COLE O PRINT AQUI ]</w:t>
-              <w:br/>
-            </w:r>
-            <w:r>
-              <w:rPr>
-                <w:rFonts w:ascii="Arial" w:hAnsi="Arial"/>
-                <w:i/>
-                <w:color w:val="94A3B8"/>
-                <w:sz w:val="18"/>
-              </w:rPr>
-              <w:t>Clique nesta caixa e cole a imagem (Ctrl + V)</w:t>
-            </w:r>
-          </w:p>
-        </w:tc>
-      </w:tr>
-    </w:tbl>
+      </w:pPr>
+      <w:r>
+        <w:drawing>
+          <wp:inline xmlns:a="http://schemas.openxmlformats.org/drawingml/2006/main" xmlns:pic="http://schemas.openxmlformats.org/drawingml/2006/picture">
+            <wp:extent cx="5486400" cy="5469228"/>
+            <wp:docPr id="3" name="Picture 3"/>
+            <wp:cNvGraphicFramePr>
+              <a:graphicFrameLocks noChangeAspect="1"/>
+            </wp:cNvGraphicFramePr>
+            <a:graphic>
+              <a:graphicData uri="http://schemas.openxmlformats.org/drawingml/2006/picture">
+                <pic:pic>
+                  <pic:nvPicPr>
+                    <pic:cNvPr id="0" name="foto_perfil.png"/>
+                    <pic:cNvPicPr/>
+                  </pic:nvPicPr>
+                  <pic:blipFill>
+                    <a:blip r:embed="rId11"/>
+                    <a:stretch>
+                      <a:fillRect/>
+                    </a:stretch>
+                  </pic:blipFill>
+                  <pic:spPr>
+                    <a:xfrm>
+                      <a:off x="0" y="0"/>
+                      <a:ext cx="5486400" cy="5469228"/>
+                    </a:xfrm>
+                    <a:prstGeom prst="rect"/>
+                  </pic:spPr>
+                </pic:pic>
+              </a:graphicData>
+            </a:graphic>
+          </wp:inline>
+        </w:drawing>
+      </w:r>
+    </w:p>
     <w:p>
       <w:pPr>
         <w:spacing w:before="80" w:after="280"/>
@@ -4534,7 +4507,7 @@
           <w:i/>
           <w:sz w:val="19"/>
         </w:rPr>
-        <w:t>Figura 12: Atividade 6 – resultado (o sistema/mapa/artigo funcionando)</w:t>
+        <w:t>Figura 12: Atividade 6 – resultado (perfil do usuário exibindo foto de avatar carregada do Garage S3 e bio)</w:t>
       </w:r>
     </w:p>
     <w:p>
@@ -4682,7 +4655,7 @@
               <w:rPr>
                 <w:b/>
               </w:rPr>
-              <w:t>Lucas Hiratuca</w:t>
+              <w:t>Lucas Tetsuya Hiratuca</w:t>
               <w:br/>
             </w:r>
             <w:r>

</xml_diff>